<commit_message>
Add audited secondary-root adaptation evidence
</commit_message>
<xml_diff>
--- a/manuscript/Plant_CellFM_v5_顶刊证据主文.docx
+++ b/manuscript/Plant_CellFM_v5_顶刊证据主文.docx
@@ -1331,37 +1331,37 @@
           <w:sz w:val="24"/>
           <w:szCs w:val="24"/>
         </w:rPr>
-        <w:t xml:space="preserve">7. 拟南芥根系候选 marker 资源连接身份层级、实验优先级与公开审计表</w:t>
-      </w:r>
-    </w:p>
-    <w:p>
-      <w:pPr>
-        <w:spacing w:after="125" w:line="296"/>
-        <w:jc w:val="both"/>
-      </w:pPr>
-      <w:r>
-        <w:rPr>
-          <w:rFonts w:ascii="Microsoft YaHei" w:cs="Microsoft YaHei" w:eastAsia="Microsoft YaHei" w:hAnsi="Microsoft YaHei"/>
-          <w:color w:val="18242E"/>
-          <w:sz w:val="20"/>
-          <w:szCs w:val="20"/>
-        </w:rPr>
-        <w:t xml:space="preserve">为了将模型输出进一步连接到可检验的生物学假设，我们以拟南芥根系建立 10 类身份的候选 marker 资源，包括柱状根冠、侧根冠、根冠、根毛、非根毛、皮层、内皮层、中柱、韧皮部和木质部。每类身份保留 top-20 候选，因此表 S13 提供 200 条候选记录及其分数、检测率、效应量和身份归属；身份层级、前五候选、效应量与检测率分离度以及候选程序强度由扩展数据图 4a–d 系统呈现。</w:t>
-      </w:r>
-    </w:p>
-    <w:p>
-      <w:pPr>
-        <w:spacing w:after="125" w:line="296"/>
-        <w:jc w:val="both"/>
-      </w:pPr>
-      <w:r>
-        <w:rPr>
-          <w:rFonts w:ascii="Microsoft YaHei" w:cs="Microsoft YaHei" w:eastAsia="Microsoft YaHei" w:hAnsi="Microsoft YaHei"/>
-          <w:color w:val="18242E"/>
-          <w:sz w:val="20"/>
-          <w:szCs w:val="20"/>
-        </w:rPr>
-        <w:t xml:space="preserve">为避免候选列表仅依赖内部排序，我们在查看候选排名前从拟南芥根系原始单细胞文献固定 6 个经典 marker-身份锚点；其中韧皮部 APL（AT1G79430）、内皮层 CASP1（AT2G36100）和木质部 MYB46（AT5G12870）分别在匹配身份程序的前 4、7 和 12 位被回收（扩展数据图 4，表 S16）。其余三个预定义锚点同样保留在审计表中而未被隐去，因而该结果是可复核的 3/6 文献一致性记录，而不是事后挑选的成功案例。研究者可以从身份层级进入候选基因，也可以从基因效应与检测分离度反查优先级。该资源严格定位为公共数据上的计算资源；文献一致性支持身份命名的生物学合理性，但候选 marker 仍代表可检验假设而非独立矩阵复现或湿实验验证结论。</w:t>
+        <w:t xml:space="preserve">7. 作者标注的次生根适配把冻结模型连接到细分血管状态，但与严格零样本证据分层报告</w:t>
+      </w:r>
+    </w:p>
+    <w:p>
+      <w:pPr>
+        <w:spacing w:after="125" w:line="296"/>
+        <w:jc w:val="both"/>
+      </w:pPr>
+      <w:r>
+        <w:rPr>
+          <w:rFonts w:ascii="Microsoft YaHei" w:cs="Microsoft YaHei" w:eastAsia="Microsoft YaHei" w:hAnsi="Microsoft YaHei"/>
+          <w:color w:val="18242E"/>
+          <w:sz w:val="20"/>
+          <w:szCs w:val="20"/>
+        </w:rPr>
+        <w:t xml:space="preserve">为检验适配接口是否能吸收具有细分次生根状态的高质量标注，我们以 GEO GSE270140 的 GSM8335426 次生根作者对象构建一个预注册的单样本适配案例。该研究以单细胞测序和谱系追踪刻画拟南芥次生生长过程中的细胞状态；经计数矩阵导出和 TAIR 基因标识符规范化后，输入包含 11,760 个细胞和 14 个作者标注状态。我们从冻结的 SRP169576 根系检查点初始化 LoRA-mode 适配，按唯一细胞 ID 进行固定随机种子（20260801）的 80/10/20 分组切分：8,232 个训练细胞、1,176 个验证细胞和 2,352 个全程锁定的测试细胞。最佳 epoch 仅由验证集 fine macro-F1 选择，不以测试集选择参数（扩展数据图 6a,e）。</w:t>
+      </w:r>
+    </w:p>
+    <w:p>
+      <w:pPr>
+        <w:spacing w:after="125" w:line="296"/>
+        <w:jc w:val="both"/>
+      </w:pPr>
+      <w:r>
+        <w:rPr>
+          <w:rFonts w:ascii="Microsoft YaHei" w:cs="Microsoft YaHei" w:eastAsia="Microsoft YaHei" w:hAnsi="Microsoft YaHei"/>
+          <w:color w:val="18242E"/>
+          <w:sz w:val="20"/>
+          <w:szCs w:val="20"/>
+        </w:rPr>
+        <w:t xml:space="preserve">在锁定测试集中，该适配器的主训练评估得到 83.97% fine accuracy 和 84.47% fine macro-F1；独立的全精度复查得到 84.18% 和 84.64%。为了在不重写原始 14 类标签的前提下检验冻结根系本体的可恢复性，我们在训练前冻结原始标签到 Phloem、Xylem 和 Root stele 的三状态映射，并仅在 1,885 个兼容的锁定测试细胞上评分。冻结基础检查点在该语义集合上的准确率为 2.02%，适配后为 90.93%，macro-F1 为 0.9159（扩展数据图 6b–d,f；表 S18）。这一结果回答的是“获得作者标注后，框架能否以可审计的方式吸收次生根上下文”；它是同一样本内的有监督适配，不是零样本、留物种、独立外部验证或第三方模型排名，因而不改变本文 v17 的严格主结果。</w:t>
       </w:r>
     </w:p>
     <w:p>
@@ -1378,54 +1378,37 @@
           <w:sz w:val="24"/>
           <w:szCs w:val="24"/>
         </w:rPr>
-        <w:t xml:space="preserve">8. 从严格基准到部署服务的每一层输出均保留独立报告边界</w:t>
-      </w:r>
-    </w:p>
-    <w:p>
-      <w:pPr>
-        <w:spacing w:after="125" w:line="296"/>
-        <w:jc w:val="both"/>
-      </w:pPr>
-      <w:r>
-        <w:rPr>
-          <w:rFonts w:ascii="Microsoft YaHei" w:cs="Microsoft YaHei" w:eastAsia="Microsoft YaHei" w:hAnsi="Microsoft YaHei"/>
-          <w:color w:val="18242E"/>
-          <w:sz w:val="20"/>
-          <w:szCs w:val="20"/>
-        </w:rPr>
-        <w:t xml:space="preserve">Plant-CellFM 同时提供运行时全词表注释头。该模式在已经具备部署标签词表和训练分类器的前提下运行，因而不等价于严格零样本跨物种迁移。全词表运行时分析在相同对齐细胞上的全细胞准确率为 66.25%，作为部署可用性记录独立保存。模型卡、补充表 S2 和图表审计均将它明确标记为 runtime 分析，防止被误读为 v17 的严格性能。</w:t>
-      </w:r>
-    </w:p>
-    <w:p>
-      <w:pPr>
-        <w:spacing w:after="125" w:line="296"/>
-        <w:jc w:val="both"/>
-      </w:pPr>
-      <w:r>
-        <w:rPr>
-          <w:rFonts w:ascii="Microsoft YaHei" w:cs="Microsoft YaHei" w:eastAsia="Microsoft YaHei" w:hAnsi="Microsoft YaHei"/>
-          <w:color w:val="18242E"/>
-          <w:sz w:val="20"/>
-          <w:szCs w:val="20"/>
-        </w:rPr>
-        <w:t xml:space="preserve">这一分层报告建立了从图谱证据到服务接口的闭环：共享嵌入支持跨数据检索，严格评估刻画开放集风险，少样本适配提供新物种进入策略，运行时头服务已有标签体系的部署，marker 候选资源支持实验与策展。它们使用同一项目代码和数据契约，但不共享不该共享的性能标签。</w:t>
-      </w:r>
-    </w:p>
-    <w:p>
-      <w:pPr>
-        <w:pStyle w:val="Heading1"/>
-        <w:spacing w:after="120" w:before="280"/>
-      </w:pPr>
-      <w:r>
-        <w:rPr>
-          <w:rFonts w:ascii="Microsoft YaHei" w:cs="Microsoft YaHei" w:eastAsia="Microsoft YaHei" w:hAnsi="Microsoft YaHei"/>
-          <w:b/>
-          <w:bCs/>
-          <w:color w:val="18242E"/>
-          <w:sz w:val="29"/>
-          <w:szCs w:val="29"/>
-        </w:rPr>
-        <w:t xml:space="preserve">方法</w:t>
+        <w:t xml:space="preserve">8. 拟南芥根系候选 marker 资源连接身份层级、实验优先级与公开审计表</w:t>
+      </w:r>
+    </w:p>
+    <w:p>
+      <w:pPr>
+        <w:spacing w:after="125" w:line="296"/>
+        <w:jc w:val="both"/>
+      </w:pPr>
+      <w:r>
+        <w:rPr>
+          <w:rFonts w:ascii="Microsoft YaHei" w:cs="Microsoft YaHei" w:eastAsia="Microsoft YaHei" w:hAnsi="Microsoft YaHei"/>
+          <w:color w:val="18242E"/>
+          <w:sz w:val="20"/>
+          <w:szCs w:val="20"/>
+        </w:rPr>
+        <w:t xml:space="preserve">为了将模型输出进一步连接到可检验的生物学假设，我们以拟南芥根系建立 10 类身份的候选 marker 资源，包括柱状根冠、侧根冠、根冠、根毛、非根毛、皮层、内皮层、中柱、韧皮部和木质部。每类身份保留 top-20 候选，因此表 S13 提供 200 条候选记录及其分数、检测率、效应量和身份归属；身份层级、前五候选、效应量与检测率分离度以及候选程序强度由扩展数据图 4a–d 系统呈现。</w:t>
+      </w:r>
+    </w:p>
+    <w:p>
+      <w:pPr>
+        <w:spacing w:after="125" w:line="296"/>
+        <w:jc w:val="both"/>
+      </w:pPr>
+      <w:r>
+        <w:rPr>
+          <w:rFonts w:ascii="Microsoft YaHei" w:cs="Microsoft YaHei" w:eastAsia="Microsoft YaHei" w:hAnsi="Microsoft YaHei"/>
+          <w:color w:val="18242E"/>
+          <w:sz w:val="20"/>
+          <w:szCs w:val="20"/>
+        </w:rPr>
+        <w:t xml:space="preserve">为避免候选列表仅依赖内部排序，我们在查看候选排名前从拟南芥根系原始单细胞文献固定 6 个经典 marker-身份锚点；其中韧皮部 APL（AT1G79430）、内皮层 CASP1（AT2G36100）和木质部 MYB46（AT5G12870）分别在匹配身份程序的前 4、7 和 12 位被回收（扩展数据图 4，表 S16）。其余三个预定义锚点同样保留在审计表中而未被隐去，因而该结果是可复核的 3/6 文献一致性记录，而不是事后挑选的成功案例。研究者可以从身份层级进入候选基因，也可以从基因效应与检测分离度反查优先级。该资源严格定位为公共数据上的计算资源；文献一致性支持身份命名的生物学合理性，但候选 marker 仍代表可检验假设而非独立矩阵复现或湿实验验证结论。</w:t>
       </w:r>
     </w:p>
     <w:p>
@@ -1442,22 +1425,54 @@
           <w:sz w:val="24"/>
           <w:szCs w:val="24"/>
         </w:rPr>
-        <w:t xml:space="preserve">语料 profile 与严格评估面板</w:t>
-      </w:r>
-    </w:p>
-    <w:p>
-      <w:pPr>
-        <w:spacing w:after="125" w:line="296"/>
-        <w:jc w:val="both"/>
-      </w:pPr>
-      <w:r>
-        <w:rPr>
-          <w:rFonts w:ascii="Microsoft YaHei" w:cs="Microsoft YaHei" w:eastAsia="Microsoft YaHei" w:hAnsi="Microsoft YaHei"/>
-          <w:color w:val="18242E"/>
-          <w:sz w:val="20"/>
-          <w:szCs w:val="20"/>
-        </w:rPr>
-        <w:t xml:space="preserve">使用 H5AD profile 工作流统计冻结语料中的物种、数据集、样本、组织、基因和原始细胞标签，并导出 TSV 源表。严格评估以冻结嵌入、观测元数据和逐细胞预测记录为输入，将 3,964 个已对齐细胞按 8 个物种进行外层留出。严格面板中的物种数大于当前冻结语料 profile 中的物种数，代表评估的跨物种压力范围，而不代表训练语料对所有物种均有同等覆盖。</w:t>
+        <w:t xml:space="preserve">9. 从严格基准到部署服务的每一层输出均保留独立报告边界</w:t>
+      </w:r>
+    </w:p>
+    <w:p>
+      <w:pPr>
+        <w:spacing w:after="125" w:line="296"/>
+        <w:jc w:val="both"/>
+      </w:pPr>
+      <w:r>
+        <w:rPr>
+          <w:rFonts w:ascii="Microsoft YaHei" w:cs="Microsoft YaHei" w:eastAsia="Microsoft YaHei" w:hAnsi="Microsoft YaHei"/>
+          <w:color w:val="18242E"/>
+          <w:sz w:val="20"/>
+          <w:szCs w:val="20"/>
+        </w:rPr>
+        <w:t xml:space="preserve">Plant-CellFM 同时提供运行时全词表注释头。该模式在已经具备部署标签词表和训练分类器的前提下运行，因而不等价于严格零样本跨物种迁移。全词表运行时分析在相同对齐细胞上的全细胞准确率为 66.25%，作为部署可用性记录独立保存。模型卡、补充表 S2 和图表审计均将它明确标记为 runtime 分析，防止被误读为 v17 的严格性能。</w:t>
+      </w:r>
+    </w:p>
+    <w:p>
+      <w:pPr>
+        <w:spacing w:after="125" w:line="296"/>
+        <w:jc w:val="both"/>
+      </w:pPr>
+      <w:r>
+        <w:rPr>
+          <w:rFonts w:ascii="Microsoft YaHei" w:cs="Microsoft YaHei" w:eastAsia="Microsoft YaHei" w:hAnsi="Microsoft YaHei"/>
+          <w:color w:val="18242E"/>
+          <w:sz w:val="20"/>
+          <w:szCs w:val="20"/>
+        </w:rPr>
+        <w:t xml:space="preserve">这一分层报告建立了从图谱证据到服务接口的闭环：共享嵌入支持跨数据检索，严格评估刻画开放集风险，少样本适配提供新物种进入策略，运行时头服务已有标签体系的部署，marker 候选资源支持实验与策展。它们使用同一项目代码和数据契约，但不共享不该共享的性能标签。</w:t>
+      </w:r>
+    </w:p>
+    <w:p>
+      <w:pPr>
+        <w:pStyle w:val="Heading1"/>
+        <w:spacing w:after="120" w:before="280"/>
+      </w:pPr>
+      <w:r>
+        <w:rPr>
+          <w:rFonts w:ascii="Microsoft YaHei" w:cs="Microsoft YaHei" w:eastAsia="Microsoft YaHei" w:hAnsi="Microsoft YaHei"/>
+          <w:b/>
+          <w:bCs/>
+          <w:color w:val="18242E"/>
+          <w:sz w:val="29"/>
+          <w:szCs w:val="29"/>
+        </w:rPr>
+        <w:t xml:space="preserve">方法</w:t>
       </w:r>
     </w:p>
     <w:p>
@@ -1474,22 +1489,22 @@
           <w:sz w:val="24"/>
           <w:szCs w:val="24"/>
         </w:rPr>
-        <w:t xml:space="preserve">模型、基因迁移与输出接口</w:t>
-      </w:r>
-    </w:p>
-    <w:p>
-      <w:pPr>
-        <w:spacing w:after="125" w:line="296"/>
-        <w:jc w:val="both"/>
-      </w:pPr>
-      <w:r>
-        <w:rPr>
-          <w:rFonts w:ascii="Microsoft YaHei" w:cs="Microsoft YaHei" w:eastAsia="Microsoft YaHei" w:hAnsi="Microsoft YaHei"/>
-          <w:color w:val="18242E"/>
-          <w:sz w:val="20"/>
-          <w:szCs w:val="20"/>
-        </w:rPr>
-        <w:t xml:space="preserve">模型使用四层表达编码器产生 256 维细胞嵌入，支持 LoRA 适配和已登记适配器解析。数据输入为 cells × genes 矩阵。精确基因标识符首先与检查点词表对齐；需要跨参考基因组时，调用显式同源基因映射契约。层级注释路径、marker 候选排序和运行时元数据作为模型服务输出。模型能力、已验证范围和未完成比较在 release_metadata/plant_cellfm_model_card_v4.json 中分层记录；v5 图组的主张层级、逐图源数据和证据边界由 release_metadata/plant_cellfm_v5_figure_blueprint.md 单独约束。</w:t>
+        <w:t xml:space="preserve">语料 profile 与严格评估面板</w:t>
+      </w:r>
+    </w:p>
+    <w:p>
+      <w:pPr>
+        <w:spacing w:after="125" w:line="296"/>
+        <w:jc w:val="both"/>
+      </w:pPr>
+      <w:r>
+        <w:rPr>
+          <w:rFonts w:ascii="Microsoft YaHei" w:cs="Microsoft YaHei" w:eastAsia="Microsoft YaHei" w:hAnsi="Microsoft YaHei"/>
+          <w:color w:val="18242E"/>
+          <w:sz w:val="20"/>
+          <w:szCs w:val="20"/>
+        </w:rPr>
+        <w:t xml:space="preserve">使用 H5AD profile 工作流统计冻结语料中的物种、数据集、样本、组织、基因和原始细胞标签，并导出 TSV 源表。严格评估以冻结嵌入、观测元数据和逐细胞预测记录为输入，将 3,964 个已对齐细胞按 8 个物种进行外层留出。严格面板中的物种数大于当前冻结语料 profile 中的物种数，代表评估的跨物种压力范围，而不代表训练语料对所有物种均有同等覆盖。</w:t>
       </w:r>
     </w:p>
     <w:p>
@@ -1506,37 +1521,22 @@
           <w:sz w:val="24"/>
           <w:szCs w:val="24"/>
         </w:rPr>
-        <w:t xml:space="preserve">嵌套严格留物种评估与开放集指标</w:t>
-      </w:r>
-    </w:p>
-    <w:p>
-      <w:pPr>
-        <w:spacing w:after="125" w:line="296"/>
-        <w:jc w:val="both"/>
-      </w:pPr>
-      <w:r>
-        <w:rPr>
-          <w:rFonts w:ascii="Microsoft YaHei" w:cs="Microsoft YaHei" w:eastAsia="Microsoft YaHei" w:hAnsi="Microsoft YaHei"/>
-          <w:color w:val="18242E"/>
-          <w:sz w:val="20"/>
-          <w:szCs w:val="20"/>
-        </w:rPr>
-        <w:t xml:space="preserve">每个外层留出物种只在源物种上执行候选解码规则的内层留物种选择。最终候选规则应用于从未参与拟合或选择的目标物种。精确全细胞准确率以所有留出细胞为分母；标签覆盖率定义为目标真值标签存在于源训练标签集合中的细胞比例；条件准确率和 macro-F1 仅在可覆盖标签子集上计算。v17 同时保存候选规则排名、被选规则、逐物种汇总和逐细胞预测。</w:t>
-      </w:r>
-    </w:p>
-    <w:p>
-      <w:pPr>
-        <w:spacing w:after="125" w:line="296"/>
-        <w:jc w:val="both"/>
-      </w:pPr>
-      <w:r>
-        <w:rPr>
-          <w:rFonts w:ascii="Microsoft YaHei" w:cs="Microsoft YaHei" w:eastAsia="Microsoft YaHei" w:hAnsi="Microsoft YaHei"/>
-          <w:color w:val="18242E"/>
-          <w:sz w:val="20"/>
-          <w:szCs w:val="20"/>
-        </w:rPr>
-        <w:t xml:space="preserve">v18 对标签起始字符串为 unknown、unknow 或 unannotated 的记录实施预定义的审计规则：这类记录不参与身份拟合和打分，但继续计入原始公共标签规模、物种级排除数和图形分母。由无信息标签构成的物种不进入显式身份性能汇总。v17 与 v18 分别回答原始公共标签压力与显式身份迁移两个问题，不相互替代。</w:t>
+        <w:t xml:space="preserve">模型、基因迁移与输出接口</w:t>
+      </w:r>
+    </w:p>
+    <w:p>
+      <w:pPr>
+        <w:spacing w:after="125" w:line="296"/>
+        <w:jc w:val="both"/>
+      </w:pPr>
+      <w:r>
+        <w:rPr>
+          <w:rFonts w:ascii="Microsoft YaHei" w:cs="Microsoft YaHei" w:eastAsia="Microsoft YaHei" w:hAnsi="Microsoft YaHei"/>
+          <w:color w:val="18242E"/>
+          <w:sz w:val="20"/>
+          <w:szCs w:val="20"/>
+        </w:rPr>
+        <w:t xml:space="preserve">模型使用四层表达编码器产生 256 维细胞嵌入，支持 LoRA 适配和已登记适配器解析。数据输入为 cells × genes 矩阵。精确基因标识符首先与检查点词表对齐；需要跨参考基因组时，调用显式同源基因映射契约。层级注释路径、marker 候选排序和运行时元数据作为模型服务输出。模型能力、已验证范围和未完成比较在 release_metadata/plant_cellfm_model_card_v4.json 中分层记录；v5 图组的主张层级、逐图源数据和证据边界由 release_metadata/plant_cellfm_v5_figure_blueprint.md 单独约束。</w:t>
       </w:r>
     </w:p>
     <w:p>
@@ -1553,22 +1553,37 @@
           <w:sz w:val="24"/>
           <w:szCs w:val="24"/>
         </w:rPr>
-        <w:t xml:space="preserve">少样本适配、统计与可视化</w:t>
-      </w:r>
-    </w:p>
-    <w:p>
-      <w:pPr>
-        <w:spacing w:after="125" w:line="296"/>
-        <w:jc w:val="both"/>
-      </w:pPr>
-      <w:r>
-        <w:rPr>
-          <w:rFonts w:ascii="Microsoft YaHei" w:cs="Microsoft YaHei" w:eastAsia="Microsoft YaHei" w:hAnsi="Microsoft YaHei"/>
-          <w:color w:val="18242E"/>
-          <w:sz w:val="20"/>
-          <w:szCs w:val="20"/>
-        </w:rPr>
-        <w:t xml:space="preserve">少样本实验在每一目标物种内随机抽取固定预算的标注支持细胞，余下细胞作为查询集。支持和查询细胞按细胞 ID 强制不重叠；每个预算使用 10 个独立随机种子。图 3b,c 以均值、标准差和逐次抽样点报告结果。图 2 中对固定严格测试细胞执行非参数 bootstrap，以可视化而非替代物种级异质性。</w:t>
+        <w:t xml:space="preserve">嵌套严格留物种评估与开放集指标</w:t>
+      </w:r>
+    </w:p>
+    <w:p>
+      <w:pPr>
+        <w:spacing w:after="125" w:line="296"/>
+        <w:jc w:val="both"/>
+      </w:pPr>
+      <w:r>
+        <w:rPr>
+          <w:rFonts w:ascii="Microsoft YaHei" w:cs="Microsoft YaHei" w:eastAsia="Microsoft YaHei" w:hAnsi="Microsoft YaHei"/>
+          <w:color w:val="18242E"/>
+          <w:sz w:val="20"/>
+          <w:szCs w:val="20"/>
+        </w:rPr>
+        <w:t xml:space="preserve">每个外层留出物种只在源物种上执行候选解码规则的内层留物种选择。最终候选规则应用于从未参与拟合或选择的目标物种。精确全细胞准确率以所有留出细胞为分母；标签覆盖率定义为目标真值标签存在于源训练标签集合中的细胞比例；条件准确率和 macro-F1 仅在可覆盖标签子集上计算。v17 同时保存候选规则排名、被选规则、逐物种汇总和逐细胞预测。</w:t>
+      </w:r>
+    </w:p>
+    <w:p>
+      <w:pPr>
+        <w:spacing w:after="125" w:line="296"/>
+        <w:jc w:val="both"/>
+      </w:pPr>
+      <w:r>
+        <w:rPr>
+          <w:rFonts w:ascii="Microsoft YaHei" w:cs="Microsoft YaHei" w:eastAsia="Microsoft YaHei" w:hAnsi="Microsoft YaHei"/>
+          <w:color w:val="18242E"/>
+          <w:sz w:val="20"/>
+          <w:szCs w:val="20"/>
+        </w:rPr>
+        <w:t xml:space="preserve">v18 对标签起始字符串为 unknown、unknow 或 unannotated 的记录实施预定义的审计规则：这类记录不参与身份拟合和打分，但继续计入原始公共标签规模、物种级排除数和图形分母。由无信息标签构成的物种不进入显式身份性能汇总。v17 与 v18 分别回答原始公共标签压力与显式身份迁移两个问题，不相互替代。</w:t>
       </w:r>
     </w:p>
     <w:p>
@@ -1585,6 +1600,38 @@
           <w:sz w:val="24"/>
           <w:szCs w:val="24"/>
         </w:rPr>
+        <w:t xml:space="preserve">少样本适配、统计与可视化</w:t>
+      </w:r>
+    </w:p>
+    <w:p>
+      <w:pPr>
+        <w:spacing w:after="125" w:line="296"/>
+        <w:jc w:val="both"/>
+      </w:pPr>
+      <w:r>
+        <w:rPr>
+          <w:rFonts w:ascii="Microsoft YaHei" w:cs="Microsoft YaHei" w:eastAsia="Microsoft YaHei" w:hAnsi="Microsoft YaHei"/>
+          <w:color w:val="18242E"/>
+          <w:sz w:val="20"/>
+          <w:szCs w:val="20"/>
+        </w:rPr>
+        <w:t xml:space="preserve">少样本实验在每一目标物种内随机抽取固定预算的标注支持细胞，余下细胞作为查询集。支持和查询细胞按细胞 ID 强制不重叠；每个预算使用 10 个独立随机种子。图 3b,c 以均值、标准差和逐次抽样点报告结果。图 2 中对固定严格测试细胞执行非参数 bootstrap，以可视化而非替代物种级异质性。</w:t>
+      </w:r>
+    </w:p>
+    <w:p>
+      <w:pPr>
+        <w:pStyle w:val="Heading2"/>
+        <w:spacing w:after="120" w:before="210"/>
+      </w:pPr>
+      <w:r>
+        <w:rPr>
+          <w:rFonts w:ascii="Microsoft YaHei" w:cs="Microsoft YaHei" w:eastAsia="Microsoft YaHei" w:hAnsi="Microsoft YaHei"/>
+          <w:b/>
+          <w:bCs/>
+          <w:color w:val="007C83"/>
+          <w:sz w:val="24"/>
+          <w:szCs w:val="24"/>
+        </w:rPr>
         <w:t xml:space="preserve">外部盲推理与 marker 一致性审计</w:t>
       </w:r>
     </w:p>
@@ -1616,6 +1663,38 @@
           <w:szCs w:val="20"/>
         </w:rPr>
         <w:t xml:space="preserve">全部主图与扩展数据图由 Matplotlib Agg 后端生成，逐图输出可编辑 SVG、PDF、PNG、600-dpi TIFF 及对应 TSV 源数据。发布前运行 v5 图表审计，检查图件存在性、源数据、SVG 可编辑文本、TIFF 分辨率和冻结指标一致性。审计只报告技术门禁是否通过，不以自评“期刊就绪分数”替代编辑和同行评审；第三方比较和独立实验验证仍列为开放证据项，不修改已完成结果的范围。</w:t>
+      </w:r>
+    </w:p>
+    <w:p>
+      <w:pPr>
+        <w:pStyle w:val="Heading2"/>
+        <w:spacing w:after="120" w:before="210"/>
+      </w:pPr>
+      <w:r>
+        <w:rPr>
+          <w:rFonts w:ascii="Microsoft YaHei" w:cs="Microsoft YaHei" w:eastAsia="Microsoft YaHei" w:hAnsi="Microsoft YaHei"/>
+          <w:b/>
+          <w:bCs/>
+          <w:color w:val="007C83"/>
+          <w:sz w:val="24"/>
+          <w:szCs w:val="24"/>
+        </w:rPr>
+        <w:t xml:space="preserve">次生根有监督适配</w:t>
+      </w:r>
+    </w:p>
+    <w:p>
+      <w:pPr>
+        <w:spacing w:after="125" w:line="296"/>
+        <w:jc w:val="both"/>
+      </w:pPr>
+      <w:r>
+        <w:rPr>
+          <w:rFonts w:ascii="Microsoft YaHei" w:cs="Microsoft YaHei" w:eastAsia="Microsoft YaHei" w:hAnsi="Microsoft YaHei"/>
+          <w:color w:val="18242E"/>
+          <w:sz w:val="20"/>
+          <w:szCs w:val="20"/>
+        </w:rPr>
+        <w:t xml:space="preserve">GSE270140 / GSM8335426 的作者对象通过保留原始特征名、细胞 ID 和作者 annotation 字段的可审计导出链转为 cells × genes H5AD 输入；基因特征以 TAIR 主标识符进行规范化，同时保留原始名称供追溯。LoRA-mode 训练由 configs/gse270140_secondary_root_lora_adapter_4070.yaml 固定，使用 256 维四层根系检查点初始化、rank-8 适配路径、类别平衡损失和 10 个 epoch 的训练上限。训练、验证和测试按唯一 cell ID 固定分组；第 7 个 epoch 由验证 fine macro-F1 选为最佳模型。scripts/audit_gse270140_secondary_root_adapter.py 固化配置、检查点校验和、分割、逐类 F1、语义映射和详细测试复查，scripts/render_v5_secondary_root_adapter_figure.py 将这些记录连同 3,000 次固定种子 bootstrap 区间写入扩展数据图 6 的源数据。该路径的统计单元是同一样本中由作者标签监督的细胞，不能推断为跨物种独立验证。</w:t>
       </w:r>
     </w:p>
     <w:p>
@@ -1768,6 +1847,21 @@
           <w:szCs w:val="20"/>
         </w:rPr>
         <w:t xml:space="preserve">扩展数据图 5 | 无标签外部拟南芥根系矩阵的盲推理与 marker 一致性。 a，GEO GSE152766 / GSM4626007 的 6,566 个细胞在冻结 256 维模型嵌入上的 UMAP；颜色为模型预测，而非输入提供的标签。b，13 个预测状态的细胞组成、平均置信度与细胞数。c，分析前固定的 6 个经典 marker 在其预期预测群相对于全部其他预测群的平均表达分离度；点大小表示该 marker 在预期群中的检出率，文字同时给出预测群细胞数和检出率分离度。该矩阵没有专家细胞类型标签，故该图为盲推理与 marker 一致性案例，不构成准确率评估、外部模型排名或独立实验验证。</w:t>
+      </w:r>
+    </w:p>
+    <w:p>
+      <w:pPr>
+        <w:spacing w:after="125" w:line="296"/>
+        <w:jc w:val="both"/>
+      </w:pPr>
+      <w:r>
+        <w:rPr>
+          <w:rFonts w:ascii="Microsoft YaHei" w:cs="Microsoft YaHei" w:eastAsia="Microsoft YaHei" w:hAnsi="Microsoft YaHei"/>
+          <w:color w:val="18242E"/>
+          <w:sz w:val="20"/>
+          <w:szCs w:val="20"/>
+        </w:rPr>
+        <w:t xml:space="preserve">扩展数据图 6 | GSE270140 次生根作者标注监督的 LoRA-mode 适配。 a，从冻结 SRP169576 根系检查点到次生根 LoRA-mode 适配的工作流，以及按唯一 cell ID 固定的 8,232 / 1,176 / 2,352 训练、验证和锁定测试切分。b，在训练前冻结的三状态本体映射下，冻结基础检查点与适配器在相同 1,885 个兼容测试细胞上的语义恢复准确率；误差线为 3,000 次固定种子非参数 bootstrap 的 95% 区间。c，14 个原始作者状态的行标准化锁定测试混淆矩阵。d，逐类 F1 与测试细胞数。e，验证集选择轨迹。f，锁定测试的主评估与全精度复查。该图为单一样本的有监督适配，不构成严格零样本、留物种性能、独立外部准确率或第三方模型排名。</w:t>
       </w:r>
     </w:p>
     <w:p>
@@ -1820,7 +1914,13 @@
 python scripts/download_gse152766_external_root_case.py
 python scripts/prepare_gse152766_external_root_case.py
 python scripts/audit_gse152766_external_root_case.py
+python scripts/download_gse270140_external_validation.py
+python scripts/extract_gse270140_external_assets.py
+python scripts/prepare_gse270140_external_validation.py
+python -m snowcell.cli train --config configs/gse270140_secondary_root_lora_adapter_4070.yaml --device cuda
+python scripts/audit_gse270140_secondary_root_adapter.py
 python scripts/render_v5_top_journal_figures.py
+python scripts/render_v5_secondary_root_adapter_figure.py
 python scripts/write_submission_v4_supplementary_tables.py
 python scripts/audit_v5_submission_figure_suite.py
 npm ci
@@ -2007,6 +2107,21 @@
           <w:szCs w:val="20"/>
         </w:rPr>
         <w:t xml:space="preserve">NCBI Gene Expression Omnibus. Arabidopsis thaliana GSE152766, sample GSM4626007. https://www.ncbi.nlm.nih.gov/geo/query/acc.cgi?acc=GSE152766</w:t>
+      </w:r>
+    </w:p>
+    <w:p>
+      <w:pPr>
+        <w:spacing w:after="90" w:line="275"/>
+        <w:jc w:val="both"/>
+      </w:pPr>
+      <w:r>
+        <w:rPr>
+          <w:rFonts w:ascii="Microsoft YaHei" w:cs="Microsoft YaHei" w:eastAsia="Microsoft YaHei" w:hAnsi="Microsoft YaHei"/>
+          <w:color w:val="18242E"/>
+          <w:sz w:val="20"/>
+          <w:szCs w:val="20"/>
+        </w:rPr>
+        <w:t xml:space="preserve">Lyu, M. et al. The dynamic and diverse nature of parenchyma cells in the Arabidopsis root during secondary growth. Nature Plants (2025). https://doi.org/10.1038/s41477-025-01938-6</w:t>
       </w:r>
     </w:p>
     <w:p>
@@ -2303,7 +2418,7 @@
       <w:r>
         <w:drawing>
           <wp:inline distT="0" distB="0" distL="0" distR="0">
-            <wp:extent cx="6000750" cy="4000500"/>
+            <wp:extent cx="6000750" cy="3810000"/>
             <wp:effectExtent t="0" r="0" b="0" l="0"/>
             <wp:docPr id="1" name="" descr="" title=""/>
             <wp:cNvGraphicFramePr>
@@ -2328,7 +2443,7 @@
                   <pic:spPr bwMode="auto">
                     <a:xfrm>
                       <a:off x="0" y="0"/>
-                      <a:ext cx="6000750" cy="4000500"/>
+                      <a:ext cx="6000750" cy="3810000"/>
                     </a:xfrm>
                     <a:prstGeom prst="rect">
                       <a:avLst/>
@@ -2355,7 +2470,7 @@
           <w:sz w:val="17"/>
           <w:szCs w:val="17"/>
         </w:rPr>
-        <w:t xml:space="preserve">扩展数据图 4 | 拟南芥根系候选 marker 的预定义文献锚点一致性。</w:t>
+        <w:t xml:space="preserve">扩展数据图 1 | 身份完整性审计：显式身份队列与 audit-only 无信息标签的分母拆分。</w:t>
       </w:r>
     </w:p>
     <w:p>
@@ -2366,7 +2481,7 @@
       <w:r>
         <w:drawing>
           <wp:inline distT="0" distB="0" distL="0" distR="0">
-            <wp:extent cx="6000750" cy="5334000"/>
+            <wp:extent cx="6000750" cy="3810000"/>
             <wp:effectExtent t="0" r="0" b="0" l="0"/>
             <wp:docPr id="1" name="" descr="" title=""/>
             <wp:cNvGraphicFramePr>
@@ -2391,6 +2506,195 @@
                   <pic:spPr bwMode="auto">
                     <a:xfrm>
                       <a:off x="0" y="0"/>
+                      <a:ext cx="6000750" cy="3810000"/>
+                    </a:xfrm>
+                    <a:prstGeom prst="rect">
+                      <a:avLst/>
+                    </a:prstGeom>
+                  </pic:spPr>
+                </pic:pic>
+              </a:graphicData>
+            </a:graphic>
+          </wp:inline>
+        </w:drawing>
+      </w:r>
+    </w:p>
+    <w:p>
+      <w:pPr>
+        <w:spacing w:after="220"/>
+        <w:jc w:val="center"/>
+      </w:pPr>
+      <w:r>
+        <w:rPr>
+          <w:rFonts w:ascii="Microsoft YaHei" w:cs="Microsoft YaHei" w:eastAsia="Microsoft YaHei" w:hAnsi="Microsoft YaHei"/>
+          <w:i/>
+          <w:iCs/>
+          <w:color w:val="60717D"/>
+          <w:sz w:val="17"/>
+          <w:szCs w:val="17"/>
+        </w:rPr>
+        <w:t xml:space="preserve">扩展数据图 2 | 嵌套留物种规则选择审计：源物种内层评估、规则选择与外层计分分离。</w:t>
+      </w:r>
+    </w:p>
+    <w:p>
+      <w:pPr>
+        <w:spacing w:after="70" w:before="160"/>
+        <w:jc w:val="center"/>
+      </w:pPr>
+      <w:r>
+        <w:drawing>
+          <wp:inline distT="0" distB="0" distL="0" distR="0">
+            <wp:extent cx="6000750" cy="3810000"/>
+            <wp:effectExtent t="0" r="0" b="0" l="0"/>
+            <wp:docPr id="1" name="" descr="" title=""/>
+            <wp:cNvGraphicFramePr>
+              <a:graphicFrameLocks xmlns:a="http://schemas.openxmlformats.org/drawingml/2006/main" noChangeAspect="1"/>
+            </wp:cNvGraphicFramePr>
+            <a:graphic xmlns:a="http://schemas.openxmlformats.org/drawingml/2006/main">
+              <a:graphicData uri="http://schemas.openxmlformats.org/drawingml/2006/picture">
+                <pic:pic xmlns:pic="http://schemas.openxmlformats.org/drawingml/2006/picture">
+                  <pic:nvPicPr>
+                    <pic:cNvPr id="0" name="" descr=""/>
+                    <pic:cNvPicPr>
+                      <a:picLocks noChangeAspect="1" noChangeArrowheads="1"/>
+                    </pic:cNvPicPr>
+                  </pic:nvPicPr>
+                  <pic:blipFill>
+                    <a:blip r:embed="rId14" cstate="none"/>
+                    <a:srcRect/>
+                    <a:stretch>
+                      <a:fillRect/>
+                    </a:stretch>
+                  </pic:blipFill>
+                  <pic:spPr bwMode="auto">
+                    <a:xfrm>
+                      <a:off x="0" y="0"/>
+                      <a:ext cx="6000750" cy="3810000"/>
+                    </a:xfrm>
+                    <a:prstGeom prst="rect">
+                      <a:avLst/>
+                    </a:prstGeom>
+                  </pic:spPr>
+                </pic:pic>
+              </a:graphicData>
+            </a:graphic>
+          </wp:inline>
+        </w:drawing>
+      </w:r>
+    </w:p>
+    <w:p>
+      <w:pPr>
+        <w:spacing w:after="220"/>
+        <w:jc w:val="center"/>
+      </w:pPr>
+      <w:r>
+        <w:rPr>
+          <w:rFonts w:ascii="Microsoft YaHei" w:cs="Microsoft YaHei" w:eastAsia="Microsoft YaHei" w:hAnsi="Microsoft YaHei"/>
+          <w:i/>
+          <w:iCs/>
+          <w:color w:val="60717D"/>
+          <w:sz w:val="17"/>
+          <w:szCs w:val="17"/>
+        </w:rPr>
+        <w:t xml:space="preserve">扩展数据图 3 | 冻结 v3 与 Plant-CellFM v9 在相同协议下的匹配检查点比较；不作为外部模型排名。</w:t>
+      </w:r>
+    </w:p>
+    <w:p>
+      <w:pPr>
+        <w:spacing w:after="70" w:before="160"/>
+        <w:jc w:val="center"/>
+      </w:pPr>
+      <w:r>
+        <w:drawing>
+          <wp:inline distT="0" distB="0" distL="0" distR="0">
+            <wp:extent cx="6000750" cy="4000500"/>
+            <wp:effectExtent t="0" r="0" b="0" l="0"/>
+            <wp:docPr id="1" name="" descr="" title=""/>
+            <wp:cNvGraphicFramePr>
+              <a:graphicFrameLocks xmlns:a="http://schemas.openxmlformats.org/drawingml/2006/main" noChangeAspect="1"/>
+            </wp:cNvGraphicFramePr>
+            <a:graphic xmlns:a="http://schemas.openxmlformats.org/drawingml/2006/main">
+              <a:graphicData uri="http://schemas.openxmlformats.org/drawingml/2006/picture">
+                <pic:pic xmlns:pic="http://schemas.openxmlformats.org/drawingml/2006/picture">
+                  <pic:nvPicPr>
+                    <pic:cNvPr id="0" name="" descr=""/>
+                    <pic:cNvPicPr>
+                      <a:picLocks noChangeAspect="1" noChangeArrowheads="1"/>
+                    </pic:cNvPicPr>
+                  </pic:nvPicPr>
+                  <pic:blipFill>
+                    <a:blip r:embed="rId15" cstate="none"/>
+                    <a:srcRect/>
+                    <a:stretch>
+                      <a:fillRect/>
+                    </a:stretch>
+                  </pic:blipFill>
+                  <pic:spPr bwMode="auto">
+                    <a:xfrm>
+                      <a:off x="0" y="0"/>
+                      <a:ext cx="6000750" cy="4000500"/>
+                    </a:xfrm>
+                    <a:prstGeom prst="rect">
+                      <a:avLst/>
+                    </a:prstGeom>
+                  </pic:spPr>
+                </pic:pic>
+              </a:graphicData>
+            </a:graphic>
+          </wp:inline>
+        </w:drawing>
+      </w:r>
+    </w:p>
+    <w:p>
+      <w:pPr>
+        <w:spacing w:after="220"/>
+        <w:jc w:val="center"/>
+      </w:pPr>
+      <w:r>
+        <w:rPr>
+          <w:rFonts w:ascii="Microsoft YaHei" w:cs="Microsoft YaHei" w:eastAsia="Microsoft YaHei" w:hAnsi="Microsoft YaHei"/>
+          <w:i/>
+          <w:iCs/>
+          <w:color w:val="60717D"/>
+          <w:sz w:val="17"/>
+          <w:szCs w:val="17"/>
+        </w:rPr>
+        <w:t xml:space="preserve">扩展数据图 4 | 拟南芥根系候选 marker 的预定义文献锚点一致性。</w:t>
+      </w:r>
+    </w:p>
+    <w:p>
+      <w:pPr>
+        <w:spacing w:after="70" w:before="160"/>
+        <w:jc w:val="center"/>
+      </w:pPr>
+      <w:r>
+        <w:drawing>
+          <wp:inline distT="0" distB="0" distL="0" distR="0">
+            <wp:extent cx="6000750" cy="5334000"/>
+            <wp:effectExtent t="0" r="0" b="0" l="0"/>
+            <wp:docPr id="1" name="" descr="" title=""/>
+            <wp:cNvGraphicFramePr>
+              <a:graphicFrameLocks xmlns:a="http://schemas.openxmlformats.org/drawingml/2006/main" noChangeAspect="1"/>
+            </wp:cNvGraphicFramePr>
+            <a:graphic xmlns:a="http://schemas.openxmlformats.org/drawingml/2006/main">
+              <a:graphicData uri="http://schemas.openxmlformats.org/drawingml/2006/picture">
+                <pic:pic xmlns:pic="http://schemas.openxmlformats.org/drawingml/2006/picture">
+                  <pic:nvPicPr>
+                    <pic:cNvPr id="0" name="" descr=""/>
+                    <pic:cNvPicPr>
+                      <a:picLocks noChangeAspect="1" noChangeArrowheads="1"/>
+                    </pic:cNvPicPr>
+                  </pic:nvPicPr>
+                  <pic:blipFill>
+                    <a:blip r:embed="rId16" cstate="none"/>
+                    <a:srcRect/>
+                    <a:stretch>
+                      <a:fillRect/>
+                    </a:stretch>
+                  </pic:blipFill>
+                  <pic:spPr bwMode="auto">
+                    <a:xfrm>
+                      <a:off x="0" y="0"/>
                       <a:ext cx="6000750" cy="5334000"/>
                     </a:xfrm>
                     <a:prstGeom prst="rect">
@@ -2419,6 +2723,69 @@
           <w:szCs w:val="17"/>
         </w:rPr>
         <w:t xml:space="preserve">扩展数据图 5 | 无标签外部拟南芥根系矩阵的盲推理与 marker 一致性。</w:t>
+      </w:r>
+    </w:p>
+    <w:p>
+      <w:pPr>
+        <w:spacing w:after="70" w:before="160"/>
+        <w:jc w:val="center"/>
+      </w:pPr>
+      <w:r>
+        <w:drawing>
+          <wp:inline distT="0" distB="0" distL="0" distR="0">
+            <wp:extent cx="6000750" cy="5905500"/>
+            <wp:effectExtent t="0" r="0" b="0" l="0"/>
+            <wp:docPr id="1" name="" descr="" title=""/>
+            <wp:cNvGraphicFramePr>
+              <a:graphicFrameLocks xmlns:a="http://schemas.openxmlformats.org/drawingml/2006/main" noChangeAspect="1"/>
+            </wp:cNvGraphicFramePr>
+            <a:graphic xmlns:a="http://schemas.openxmlformats.org/drawingml/2006/main">
+              <a:graphicData uri="http://schemas.openxmlformats.org/drawingml/2006/picture">
+                <pic:pic xmlns:pic="http://schemas.openxmlformats.org/drawingml/2006/picture">
+                  <pic:nvPicPr>
+                    <pic:cNvPr id="0" name="" descr=""/>
+                    <pic:cNvPicPr>
+                      <a:picLocks noChangeAspect="1" noChangeArrowheads="1"/>
+                    </pic:cNvPicPr>
+                  </pic:nvPicPr>
+                  <pic:blipFill>
+                    <a:blip r:embed="rId17" cstate="none"/>
+                    <a:srcRect/>
+                    <a:stretch>
+                      <a:fillRect/>
+                    </a:stretch>
+                  </pic:blipFill>
+                  <pic:spPr bwMode="auto">
+                    <a:xfrm>
+                      <a:off x="0" y="0"/>
+                      <a:ext cx="6000750" cy="5905500"/>
+                    </a:xfrm>
+                    <a:prstGeom prst="rect">
+                      <a:avLst/>
+                    </a:prstGeom>
+                  </pic:spPr>
+                </pic:pic>
+              </a:graphicData>
+            </a:graphic>
+          </wp:inline>
+        </w:drawing>
+      </w:r>
+    </w:p>
+    <w:p>
+      <w:pPr>
+        <w:spacing w:after="220"/>
+        <w:jc w:val="center"/>
+      </w:pPr>
+      <w:r>
+        <w:rPr>
+          <w:rFonts w:ascii="Microsoft YaHei" w:cs="Microsoft YaHei" w:eastAsia="Microsoft YaHei" w:hAnsi="Microsoft YaHei"/>
+          <w:i/>
+          <w:iCs/>
+          <w:color w:val="60717D"/>
+          <w:sz w:val="17"/>
+          <w:szCs w:val="17"/>
+        </w:rPr>
+        <w:t xml:space="preserve">扩展数据图 6 | GSE270140 作者标注监督的次生根 LoRA-mode 适配与同一锁定测试细胞上的三状态语义恢复。该结果为单样本有监督适配，不作为零样本或独立外部验证声明。</w:t>
       </w:r>
     </w:p>
     <w:sectPr>

</xml_diff>